<commit_message>
docs: Word 与 PDF 统一为 21 页同版
</commit_message>
<xml_diff>
--- a/docs/技术文档-极构需求诊断顾问.docx
+++ b/docs/技术文档-极构需求诊断顾问.docx
@@ -343,13 +343,13 @@
           <w:right w:w="0" w:type="dxa"/>
         </w:tblCellMar>
         <w:tblLayout w:type="fixed"/>
-        <w:tblW w:w="8618" w:type="dxa"/>
+        <w:tblW w:w="9072" w:type="dxa"/>
       </w:tblPr>
       <w:tblGrid>
-        <w:gridCol w:w="3515"/>
+        <w:gridCol w:w="3402"/>
         <w:gridCol w:w="567"/>
-        <w:gridCol w:w="454"/>
-        <w:gridCol w:w="3515"/>
+        <w:gridCol w:w="1134"/>
+        <w:gridCol w:w="3402"/>
         <w:gridCol w:w="567"/>
       </w:tblGrid>
       <w:tr>
@@ -358,7 +358,7 @@
         </w:trPr>
         <w:tc>
           <w:tcPr>
-            <w:tcW w:type="dxa" w:w="3515"/>
+            <w:tcW w:type="dxa" w:w="3402"/>
           </w:tcPr>
           <w:p>
             <w:pPr>
@@ -397,13 +397,13 @@
         </w:tc>
         <w:tc>
           <w:tcPr>
-            <w:tcW w:type="dxa" w:w="454"/>
+            <w:tcW w:type="dxa" w:w="1134"/>
           </w:tcPr>
           <w:p/>
         </w:tc>
         <w:tc>
           <w:tcPr>
-            <w:tcW w:type="dxa" w:w="3515"/>
+            <w:tcW w:type="dxa" w:w="3402"/>
           </w:tcPr>
           <w:p>
             <w:pPr>
@@ -436,7 +436,7 @@
                 <w:color w:val="1F2937"/>
                 <w:sz w:val="16"/>
               </w:rPr>
-              <w:t>12</w:t>
+              <w:t>11</w:t>
             </w:r>
           </w:p>
         </w:tc>
@@ -447,7 +447,7 @@
         </w:trPr>
         <w:tc>
           <w:tcPr>
-            <w:tcW w:type="dxa" w:w="3515"/>
+            <w:tcW w:type="dxa" w:w="3402"/>
           </w:tcPr>
           <w:p>
             <w:pPr>
@@ -486,13 +486,13 @@
         </w:tc>
         <w:tc>
           <w:tcPr>
-            <w:tcW w:type="dxa" w:w="454"/>
+            <w:tcW w:type="dxa" w:w="1134"/>
           </w:tcPr>
           <w:p/>
         </w:tc>
         <w:tc>
           <w:tcPr>
-            <w:tcW w:type="dxa" w:w="3515"/>
+            <w:tcW w:type="dxa" w:w="3402"/>
           </w:tcPr>
           <w:p>
             <w:pPr>
@@ -536,7 +536,7 @@
         </w:trPr>
         <w:tc>
           <w:tcPr>
-            <w:tcW w:type="dxa" w:w="3515"/>
+            <w:tcW w:type="dxa" w:w="3402"/>
           </w:tcPr>
           <w:p>
             <w:pPr>
@@ -575,13 +575,13 @@
         </w:tc>
         <w:tc>
           <w:tcPr>
-            <w:tcW w:type="dxa" w:w="454"/>
+            <w:tcW w:type="dxa" w:w="1134"/>
           </w:tcPr>
           <w:p/>
         </w:tc>
         <w:tc>
           <w:tcPr>
-            <w:tcW w:type="dxa" w:w="3515"/>
+            <w:tcW w:type="dxa" w:w="3402"/>
           </w:tcPr>
           <w:p>
             <w:pPr>
@@ -625,7 +625,7 @@
         </w:trPr>
         <w:tc>
           <w:tcPr>
-            <w:tcW w:type="dxa" w:w="3515"/>
+            <w:tcW w:type="dxa" w:w="3402"/>
           </w:tcPr>
           <w:p>
             <w:pPr>
@@ -664,13 +664,13 @@
         </w:tc>
         <w:tc>
           <w:tcPr>
-            <w:tcW w:type="dxa" w:w="454"/>
+            <w:tcW w:type="dxa" w:w="1134"/>
           </w:tcPr>
           <w:p/>
         </w:tc>
         <w:tc>
           <w:tcPr>
-            <w:tcW w:type="dxa" w:w="3515"/>
+            <w:tcW w:type="dxa" w:w="3402"/>
           </w:tcPr>
           <w:p>
             <w:pPr>
@@ -714,7 +714,7 @@
         </w:trPr>
         <w:tc>
           <w:tcPr>
-            <w:tcW w:type="dxa" w:w="3515"/>
+            <w:tcW w:type="dxa" w:w="3402"/>
           </w:tcPr>
           <w:p>
             <w:pPr>
@@ -753,13 +753,13 @@
         </w:tc>
         <w:tc>
           <w:tcPr>
-            <w:tcW w:type="dxa" w:w="454"/>
+            <w:tcW w:type="dxa" w:w="1134"/>
           </w:tcPr>
           <w:p/>
         </w:tc>
         <w:tc>
           <w:tcPr>
-            <w:tcW w:type="dxa" w:w="3515"/>
+            <w:tcW w:type="dxa" w:w="3402"/>
           </w:tcPr>
           <w:p>
             <w:pPr>
@@ -803,7 +803,7 @@
         </w:trPr>
         <w:tc>
           <w:tcPr>
-            <w:tcW w:type="dxa" w:w="3515"/>
+            <w:tcW w:type="dxa" w:w="3402"/>
           </w:tcPr>
           <w:p>
             <w:pPr>
@@ -842,13 +842,13 @@
         </w:tc>
         <w:tc>
           <w:tcPr>
-            <w:tcW w:type="dxa" w:w="454"/>
+            <w:tcW w:type="dxa" w:w="1134"/>
           </w:tcPr>
           <w:p/>
         </w:tc>
         <w:tc>
           <w:tcPr>
-            <w:tcW w:type="dxa" w:w="3515"/>
+            <w:tcW w:type="dxa" w:w="3402"/>
           </w:tcPr>
           <w:p>
             <w:pPr>
@@ -892,7 +892,7 @@
         </w:trPr>
         <w:tc>
           <w:tcPr>
-            <w:tcW w:type="dxa" w:w="3515"/>
+            <w:tcW w:type="dxa" w:w="3402"/>
           </w:tcPr>
           <w:p>
             <w:pPr>
@@ -931,13 +931,13 @@
         </w:tc>
         <w:tc>
           <w:tcPr>
-            <w:tcW w:type="dxa" w:w="454"/>
+            <w:tcW w:type="dxa" w:w="1134"/>
           </w:tcPr>
           <w:p/>
         </w:tc>
         <w:tc>
           <w:tcPr>
-            <w:tcW w:type="dxa" w:w="3515"/>
+            <w:tcW w:type="dxa" w:w="3402"/>
           </w:tcPr>
           <w:p>
             <w:pPr>
@@ -981,7 +981,7 @@
         </w:trPr>
         <w:tc>
           <w:tcPr>
-            <w:tcW w:type="dxa" w:w="3515"/>
+            <w:tcW w:type="dxa" w:w="3402"/>
           </w:tcPr>
           <w:p>
             <w:pPr>
@@ -1020,13 +1020,13 @@
         </w:tc>
         <w:tc>
           <w:tcPr>
-            <w:tcW w:type="dxa" w:w="454"/>
+            <w:tcW w:type="dxa" w:w="1134"/>
           </w:tcPr>
           <w:p/>
         </w:tc>
         <w:tc>
           <w:tcPr>
-            <w:tcW w:type="dxa" w:w="3515"/>
+            <w:tcW w:type="dxa" w:w="3402"/>
           </w:tcPr>
           <w:p>
             <w:pPr>
@@ -1070,7 +1070,7 @@
         </w:trPr>
         <w:tc>
           <w:tcPr>
-            <w:tcW w:type="dxa" w:w="3515"/>
+            <w:tcW w:type="dxa" w:w="3402"/>
           </w:tcPr>
           <w:p>
             <w:pPr>
@@ -1109,13 +1109,13 @@
         </w:tc>
         <w:tc>
           <w:tcPr>
-            <w:tcW w:type="dxa" w:w="454"/>
+            <w:tcW w:type="dxa" w:w="1134"/>
           </w:tcPr>
           <w:p/>
         </w:tc>
         <w:tc>
           <w:tcPr>
-            <w:tcW w:type="dxa" w:w="3515"/>
+            <w:tcW w:type="dxa" w:w="3402"/>
           </w:tcPr>
           <w:p>
             <w:pPr>
@@ -1159,7 +1159,7 @@
         </w:trPr>
         <w:tc>
           <w:tcPr>
-            <w:tcW w:type="dxa" w:w="3515"/>
+            <w:tcW w:type="dxa" w:w="3402"/>
           </w:tcPr>
           <w:p>
             <w:pPr>
@@ -1198,13 +1198,13 @@
         </w:tc>
         <w:tc>
           <w:tcPr>
-            <w:tcW w:type="dxa" w:w="454"/>
+            <w:tcW w:type="dxa" w:w="1134"/>
           </w:tcPr>
           <w:p/>
         </w:tc>
         <w:tc>
           <w:tcPr>
-            <w:tcW w:type="dxa" w:w="3515"/>
+            <w:tcW w:type="dxa" w:w="3402"/>
           </w:tcPr>
           <w:p>
             <w:pPr>
@@ -1248,7 +1248,7 @@
         </w:trPr>
         <w:tc>
           <w:tcPr>
-            <w:tcW w:type="dxa" w:w="3515"/>
+            <w:tcW w:type="dxa" w:w="3402"/>
           </w:tcPr>
           <w:p>
             <w:pPr>
@@ -1287,13 +1287,13 @@
         </w:tc>
         <w:tc>
           <w:tcPr>
-            <w:tcW w:type="dxa" w:w="454"/>
+            <w:tcW w:type="dxa" w:w="1134"/>
           </w:tcPr>
           <w:p/>
         </w:tc>
         <w:tc>
           <w:tcPr>
-            <w:tcW w:type="dxa" w:w="3515"/>
+            <w:tcW w:type="dxa" w:w="3402"/>
           </w:tcPr>
           <w:p>
             <w:pPr>
@@ -1337,7 +1337,7 @@
         </w:trPr>
         <w:tc>
           <w:tcPr>
-            <w:tcW w:type="dxa" w:w="3515"/>
+            <w:tcW w:type="dxa" w:w="3402"/>
           </w:tcPr>
           <w:p>
             <w:pPr>
@@ -1376,13 +1376,13 @@
         </w:tc>
         <w:tc>
           <w:tcPr>
-            <w:tcW w:type="dxa" w:w="454"/>
+            <w:tcW w:type="dxa" w:w="1134"/>
           </w:tcPr>
           <w:p/>
         </w:tc>
         <w:tc>
           <w:tcPr>
-            <w:tcW w:type="dxa" w:w="3515"/>
+            <w:tcW w:type="dxa" w:w="3402"/>
           </w:tcPr>
           <w:p>
             <w:pPr>
@@ -1426,7 +1426,7 @@
         </w:trPr>
         <w:tc>
           <w:tcPr>
-            <w:tcW w:type="dxa" w:w="3515"/>
+            <w:tcW w:type="dxa" w:w="3402"/>
           </w:tcPr>
           <w:p>
             <w:pPr>
@@ -1465,13 +1465,13 @@
         </w:tc>
         <w:tc>
           <w:tcPr>
-            <w:tcW w:type="dxa" w:w="454"/>
+            <w:tcW w:type="dxa" w:w="1134"/>
           </w:tcPr>
           <w:p/>
         </w:tc>
         <w:tc>
           <w:tcPr>
-            <w:tcW w:type="dxa" w:w="3515"/>
+            <w:tcW w:type="dxa" w:w="3402"/>
           </w:tcPr>
           <w:p>
             <w:pPr>
@@ -1515,7 +1515,7 @@
         </w:trPr>
         <w:tc>
           <w:tcPr>
-            <w:tcW w:type="dxa" w:w="3515"/>
+            <w:tcW w:type="dxa" w:w="3402"/>
           </w:tcPr>
           <w:p>
             <w:pPr>
@@ -1554,13 +1554,13 @@
         </w:tc>
         <w:tc>
           <w:tcPr>
-            <w:tcW w:type="dxa" w:w="454"/>
+            <w:tcW w:type="dxa" w:w="1134"/>
           </w:tcPr>
           <w:p/>
         </w:tc>
         <w:tc>
           <w:tcPr>
-            <w:tcW w:type="dxa" w:w="3515"/>
+            <w:tcW w:type="dxa" w:w="3402"/>
           </w:tcPr>
           <w:p>
             <w:pPr>
@@ -1604,7 +1604,7 @@
         </w:trPr>
         <w:tc>
           <w:tcPr>
-            <w:tcW w:type="dxa" w:w="3515"/>
+            <w:tcW w:type="dxa" w:w="3402"/>
           </w:tcPr>
           <w:p>
             <w:pPr>
@@ -1643,13 +1643,13 @@
         </w:tc>
         <w:tc>
           <w:tcPr>
-            <w:tcW w:type="dxa" w:w="454"/>
+            <w:tcW w:type="dxa" w:w="1134"/>
           </w:tcPr>
           <w:p/>
         </w:tc>
         <w:tc>
           <w:tcPr>
-            <w:tcW w:type="dxa" w:w="3515"/>
+            <w:tcW w:type="dxa" w:w="3402"/>
           </w:tcPr>
           <w:p>
             <w:pPr>
@@ -1693,7 +1693,7 @@
         </w:trPr>
         <w:tc>
           <w:tcPr>
-            <w:tcW w:type="dxa" w:w="3515"/>
+            <w:tcW w:type="dxa" w:w="3402"/>
           </w:tcPr>
           <w:p>
             <w:pPr>
@@ -1726,19 +1726,19 @@
                 <w:color w:val="1F2937"/>
                 <w:sz w:val="16"/>
               </w:rPr>
-              <w:t>9</w:t>
-            </w:r>
-          </w:p>
-        </w:tc>
-        <w:tc>
-          <w:tcPr>
-            <w:tcW w:type="dxa" w:w="454"/>
+              <w:t>8</w:t>
+            </w:r>
+          </w:p>
+        </w:tc>
+        <w:tc>
+          <w:tcPr>
+            <w:tcW w:type="dxa" w:w="1134"/>
           </w:tcPr>
           <w:p/>
         </w:tc>
         <w:tc>
           <w:tcPr>
-            <w:tcW w:type="dxa" w:w="3515"/>
+            <w:tcW w:type="dxa" w:w="3402"/>
           </w:tcPr>
           <w:p>
             <w:pPr>
@@ -1782,7 +1782,7 @@
         </w:trPr>
         <w:tc>
           <w:tcPr>
-            <w:tcW w:type="dxa" w:w="3515"/>
+            <w:tcW w:type="dxa" w:w="3402"/>
           </w:tcPr>
           <w:p>
             <w:pPr>
@@ -1821,13 +1821,13 @@
         </w:tc>
         <w:tc>
           <w:tcPr>
-            <w:tcW w:type="dxa" w:w="454"/>
+            <w:tcW w:type="dxa" w:w="1134"/>
           </w:tcPr>
           <w:p/>
         </w:tc>
         <w:tc>
           <w:tcPr>
-            <w:tcW w:type="dxa" w:w="3515"/>
+            <w:tcW w:type="dxa" w:w="3402"/>
           </w:tcPr>
           <w:p>
             <w:pPr>
@@ -1871,7 +1871,7 @@
         </w:trPr>
         <w:tc>
           <w:tcPr>
-            <w:tcW w:type="dxa" w:w="3515"/>
+            <w:tcW w:type="dxa" w:w="3402"/>
           </w:tcPr>
           <w:p>
             <w:pPr>
@@ -1904,19 +1904,19 @@
                 <w:color w:val="1F2937"/>
                 <w:sz w:val="16"/>
               </w:rPr>
-              <w:t>10</w:t>
-            </w:r>
-          </w:p>
-        </w:tc>
-        <w:tc>
-          <w:tcPr>
-            <w:tcW w:type="dxa" w:w="454"/>
+              <w:t>9</w:t>
+            </w:r>
+          </w:p>
+        </w:tc>
+        <w:tc>
+          <w:tcPr>
+            <w:tcW w:type="dxa" w:w="1134"/>
           </w:tcPr>
           <w:p/>
         </w:tc>
         <w:tc>
           <w:tcPr>
-            <w:tcW w:type="dxa" w:w="3515"/>
+            <w:tcW w:type="dxa" w:w="3402"/>
           </w:tcPr>
           <w:p>
             <w:pPr>
@@ -1960,7 +1960,7 @@
         </w:trPr>
         <w:tc>
           <w:tcPr>
-            <w:tcW w:type="dxa" w:w="3515"/>
+            <w:tcW w:type="dxa" w:w="3402"/>
           </w:tcPr>
           <w:p>
             <w:pPr>
@@ -1999,13 +1999,13 @@
         </w:tc>
         <w:tc>
           <w:tcPr>
-            <w:tcW w:type="dxa" w:w="454"/>
+            <w:tcW w:type="dxa" w:w="1134"/>
           </w:tcPr>
           <w:p/>
         </w:tc>
         <w:tc>
           <w:tcPr>
-            <w:tcW w:type="dxa" w:w="3515"/>
+            <w:tcW w:type="dxa" w:w="3402"/>
           </w:tcPr>
           <w:p>
             <w:pPr>
@@ -2049,7 +2049,7 @@
         </w:trPr>
         <w:tc>
           <w:tcPr>
-            <w:tcW w:type="dxa" w:w="3515"/>
+            <w:tcW w:type="dxa" w:w="3402"/>
           </w:tcPr>
           <w:p>
             <w:pPr>
@@ -2088,13 +2088,13 @@
         </w:tc>
         <w:tc>
           <w:tcPr>
-            <w:tcW w:type="dxa" w:w="454"/>
+            <w:tcW w:type="dxa" w:w="1134"/>
           </w:tcPr>
           <w:p/>
         </w:tc>
         <w:tc>
           <w:tcPr>
-            <w:tcW w:type="dxa" w:w="3515"/>
+            <w:tcW w:type="dxa" w:w="3402"/>
           </w:tcPr>
           <w:p>
             <w:pPr>
@@ -2127,7 +2127,7 @@
                 <w:color w:val="1F2937"/>
                 <w:sz w:val="17"/>
               </w:rPr>
-              <w:t>20</w:t>
+              <w:t>19</w:t>
             </w:r>
           </w:p>
         </w:tc>
@@ -2138,7 +2138,7 @@
         </w:trPr>
         <w:tc>
           <w:tcPr>
-            <w:tcW w:type="dxa" w:w="3515"/>
+            <w:tcW w:type="dxa" w:w="3402"/>
           </w:tcPr>
           <w:p>
             <w:pPr>
@@ -2177,13 +2177,13 @@
         </w:tc>
         <w:tc>
           <w:tcPr>
-            <w:tcW w:type="dxa" w:w="454"/>
+            <w:tcW w:type="dxa" w:w="1134"/>
           </w:tcPr>
           <w:p/>
         </w:tc>
         <w:tc>
           <w:tcPr>
-            <w:tcW w:type="dxa" w:w="3515"/>
+            <w:tcW w:type="dxa" w:w="3402"/>
           </w:tcPr>
           <w:p>
             <w:pPr>
@@ -2227,7 +2227,7 @@
         </w:trPr>
         <w:tc>
           <w:tcPr>
-            <w:tcW w:type="dxa" w:w="3515"/>
+            <w:tcW w:type="dxa" w:w="3402"/>
           </w:tcPr>
           <w:p>
             <w:pPr>
@@ -2260,19 +2260,19 @@
                 <w:color w:val="1F2937"/>
                 <w:sz w:val="16"/>
               </w:rPr>
-              <w:t>11</w:t>
-            </w:r>
-          </w:p>
-        </w:tc>
-        <w:tc>
-          <w:tcPr>
-            <w:tcW w:type="dxa" w:w="454"/>
+              <w:t>10</w:t>
+            </w:r>
+          </w:p>
+        </w:tc>
+        <w:tc>
+          <w:tcPr>
+            <w:tcW w:type="dxa" w:w="1134"/>
           </w:tcPr>
           <w:p/>
         </w:tc>
         <w:tc>
           <w:tcPr>
-            <w:tcW w:type="dxa" w:w="3515"/>
+            <w:tcW w:type="dxa" w:w="3402"/>
           </w:tcPr>
           <w:p>
             <w:pPr>
@@ -2316,7 +2316,7 @@
         </w:trPr>
         <w:tc>
           <w:tcPr>
-            <w:tcW w:type="dxa" w:w="3515"/>
+            <w:tcW w:type="dxa" w:w="3402"/>
           </w:tcPr>
           <w:p>
             <w:pPr>
@@ -2355,13 +2355,13 @@
         </w:tc>
         <w:tc>
           <w:tcPr>
-            <w:tcW w:type="dxa" w:w="454"/>
+            <w:tcW w:type="dxa" w:w="1134"/>
           </w:tcPr>
           <w:p/>
         </w:tc>
         <w:tc>
           <w:tcPr>
-            <w:tcW w:type="dxa" w:w="3515"/>
+            <w:tcW w:type="dxa" w:w="3402"/>
           </w:tcPr>
           <w:p/>
         </w:tc>
@@ -4521,6 +4521,7 @@
     <w:p>
       <w:pPr>
         <w:pStyle w:val="Heading1"/>
+        <w:pageBreakBefore/>
       </w:pPr>
       <w:r>
         <w:t>三、系统架构设计</w:t>
@@ -12022,6 +12023,7 @@
     <w:p>
       <w:pPr>
         <w:pStyle w:val="Heading1"/>
+        <w:pageBreakBefore/>
       </w:pPr>
       <w:r>
         <w:t>附录 C  团队信息</w:t>

</xml_diff>